<commit_message>
Match report formatting to the engineer's reference (TwoBlues)
Formatting fixes to the modern template, verified with a LibreOffice render:
- Cover title + "SAM REPORT" (the Title style) -> WHITE, so they read on the red
  cover banner instead of black.
- Section headings (BodyHeadingSectionTitle): 16pt, slate accent (0F4761), space
  above (before 360 / after 80), keep-with-next, underline removed — were tiny,
  underlined, and unspaced.
- Body paragraphs (BodyText): 11pt, justified (jc=both), 6pt before/after, flush
  left (dropped the 0.5" indent).
- Section headings + the Table of Contents are now UNNUMBERED, matching the
  reference (outlineLvl kept so Word's live TOC still collects them).

Style edits are full paragraph-style-definition swaps (linked *Char styles left
alone, since headings/body apply these as paragraph styles).

Co-Authored-By: Claude Opus 4.8 <noreply@anthropic.com>
</commit_message>
<xml_diff>
--- a/app/modules/sam_report/assets/report_template_modern.docx
+++ b/app/modules/sam_report/assets/report_template_modern.docx
@@ -2054,7 +2054,6 @@
       <w:pPr>
         <w:pStyle w:val="TOC1"/>
         <w:tabs>
-          <w:tab w:val="left" w:pos="454"/>
           <w:tab w:val="right" w:leader="dot" w:pos="11239"/>
         </w:tabs>
         <w:rPr>
@@ -2069,18 +2068,6 @@
       </w:r>
       <w:r>
         <w:fldChar w:fldCharType="separate"/>
-      </w:r>
-      <w:r>
-        <w:rPr>
-          <w:rFonts w:ascii="Jost" w:hAnsi="Jost"/>
-        </w:rPr>
-        <w:t>1</w:t>
-      </w:r>
-      <w:r>
-        <w:rPr>
-          <w:rFonts w:ascii="Jost" w:hAnsi="Jost"/>
-        </w:rPr>
-        <w:tab/>
       </w:r>
       <w:r>
         <w:rPr>
@@ -2105,25 +2092,12 @@
       <w:pPr>
         <w:pStyle w:val="TOC1"/>
         <w:tabs>
-          <w:tab w:val="left" w:pos="454"/>
           <w:tab w:val="right" w:leader="dot" w:pos="11239"/>
         </w:tabs>
         <w:rPr>
           <w:rFonts w:ascii="Jost" w:hAnsi="Jost"/>
         </w:rPr>
       </w:pPr>
-      <w:r>
-        <w:rPr>
-          <w:rFonts w:ascii="Jost" w:hAnsi="Jost"/>
-        </w:rPr>
-        <w:t>2</w:t>
-      </w:r>
-      <w:r>
-        <w:rPr>
-          <w:rFonts w:ascii="Jost" w:hAnsi="Jost"/>
-        </w:rPr>
-        <w:tab/>
-      </w:r>
       <w:r>
         <w:rPr>
           <w:rFonts w:ascii="Jost" w:hAnsi="Jost"/>
@@ -2147,25 +2121,12 @@
       <w:pPr>
         <w:pStyle w:val="TOC1"/>
         <w:tabs>
-          <w:tab w:val="left" w:pos="454"/>
           <w:tab w:val="right" w:leader="dot" w:pos="11239"/>
         </w:tabs>
         <w:rPr>
           <w:rFonts w:ascii="Jost" w:hAnsi="Jost"/>
         </w:rPr>
       </w:pPr>
-      <w:r>
-        <w:rPr>
-          <w:rFonts w:ascii="Jost" w:hAnsi="Jost"/>
-        </w:rPr>
-        <w:t>3</w:t>
-      </w:r>
-      <w:r>
-        <w:rPr>
-          <w:rFonts w:ascii="Jost" w:hAnsi="Jost"/>
-        </w:rPr>
-        <w:tab/>
-      </w:r>
       <w:r>
         <w:rPr>
           <w:rFonts w:ascii="Jost" w:hAnsi="Jost"/>
@@ -2189,25 +2150,12 @@
       <w:pPr>
         <w:pStyle w:val="TOC1"/>
         <w:tabs>
-          <w:tab w:val="left" w:pos="454"/>
           <w:tab w:val="right" w:leader="dot" w:pos="11239"/>
         </w:tabs>
         <w:rPr>
           <w:rFonts w:ascii="Jost" w:hAnsi="Jost"/>
         </w:rPr>
       </w:pPr>
-      <w:r>
-        <w:rPr>
-          <w:rFonts w:ascii="Jost" w:hAnsi="Jost"/>
-        </w:rPr>
-        <w:t>4</w:t>
-      </w:r>
-      <w:r>
-        <w:rPr>
-          <w:rFonts w:ascii="Jost" w:hAnsi="Jost"/>
-        </w:rPr>
-        <w:tab/>
-      </w:r>
       <w:r>
         <w:rPr>
           <w:rFonts w:ascii="Jost" w:hAnsi="Jost"/>
@@ -2231,25 +2179,12 @@
       <w:pPr>
         <w:pStyle w:val="TOC1"/>
         <w:tabs>
-          <w:tab w:val="left" w:pos="454"/>
           <w:tab w:val="right" w:leader="dot" w:pos="11239"/>
         </w:tabs>
         <w:rPr>
           <w:rFonts w:ascii="Jost" w:hAnsi="Jost"/>
         </w:rPr>
       </w:pPr>
-      <w:r>
-        <w:rPr>
-          <w:rFonts w:ascii="Jost" w:hAnsi="Jost"/>
-        </w:rPr>
-        <w:t>5</w:t>
-      </w:r>
-      <w:r>
-        <w:rPr>
-          <w:rFonts w:ascii="Jost" w:hAnsi="Jost"/>
-        </w:rPr>
-        <w:tab/>
-      </w:r>
       <w:r>
         <w:rPr>
           <w:rFonts w:ascii="Jost" w:hAnsi="Jost"/>
@@ -2273,25 +2208,12 @@
       <w:pPr>
         <w:pStyle w:val="TOC1"/>
         <w:tabs>
-          <w:tab w:val="left" w:pos="454"/>
           <w:tab w:val="right" w:leader="dot" w:pos="11239"/>
         </w:tabs>
         <w:rPr>
           <w:rFonts w:ascii="Jost" w:hAnsi="Jost"/>
         </w:rPr>
       </w:pPr>
-      <w:r>
-        <w:rPr>
-          <w:rFonts w:ascii="Jost" w:hAnsi="Jost"/>
-        </w:rPr>
-        <w:t>6</w:t>
-      </w:r>
-      <w:r>
-        <w:rPr>
-          <w:rFonts w:ascii="Jost" w:hAnsi="Jost"/>
-        </w:rPr>
-        <w:tab/>
-      </w:r>
       <w:r>
         <w:rPr>
           <w:rFonts w:ascii="Jost" w:hAnsi="Jost"/>
@@ -2315,25 +2237,12 @@
       <w:pPr>
         <w:pStyle w:val="TOC1"/>
         <w:tabs>
-          <w:tab w:val="left" w:pos="454"/>
           <w:tab w:val="right" w:leader="dot" w:pos="11239"/>
         </w:tabs>
         <w:rPr>
           <w:rFonts w:ascii="Jost" w:hAnsi="Jost"/>
         </w:rPr>
       </w:pPr>
-      <w:r>
-        <w:rPr>
-          <w:rFonts w:ascii="Jost" w:hAnsi="Jost"/>
-        </w:rPr>
-        <w:t>7</w:t>
-      </w:r>
-      <w:r>
-        <w:rPr>
-          <w:rFonts w:ascii="Jost" w:hAnsi="Jost"/>
-        </w:rPr>
-        <w:tab/>
-      </w:r>
       <w:r>
         <w:rPr>
           <w:rFonts w:ascii="Jost" w:hAnsi="Jost"/>
@@ -2375,12 +2284,6 @@
         <w:pStyle w:val="BodyHeadingSectionTitle"/>
         <w:outlineLvl w:val="0"/>
       </w:pPr>
-      <w:r>
-        <w:t>1</w:t>
-      </w:r>
-      <w:r>
-        <w:tab/>
-      </w:r>
       <w:bookmarkStart w:id="1" w:name="_Toc308014135"/>
       <w:bookmarkStart w:id="2" w:name="_Toc137546890"/>
       <w:bookmarkStart w:id="3" w:name="_Toc210896268"/>
@@ -2520,12 +2423,6 @@
         <w:pStyle w:val="BodyHeadingSectionTitle"/>
         <w:outlineLvl w:val="0"/>
       </w:pPr>
-      <w:r>
-        <w:t>2</w:t>
-      </w:r>
-      <w:r>
-        <w:tab/>
-      </w:r>
       <w:bookmarkStart w:id="4" w:name="_Toc308014136"/>
       <w:bookmarkStart w:id="5" w:name="_Toc307499948"/>
       <w:bookmarkStart w:id="6" w:name="_Toc307501037"/>
@@ -2634,12 +2531,6 @@
         <w:pStyle w:val="BodyHeadingSectionTitle"/>
         <w:outlineLvl w:val="0"/>
       </w:pPr>
-      <w:r>
-        <w:t>3</w:t>
-      </w:r>
-      <w:r>
-        <w:tab/>
-      </w:r>
       <w:bookmarkStart w:id="11" w:name="_Toc308014140"/>
       <w:bookmarkStart w:id="12" w:name="_Toc137546893"/>
       <w:bookmarkStart w:id="13" w:name="_Toc210896270"/>
@@ -2821,12 +2712,6 @@
         <w:keepNext w:val="0"/>
         <w:outlineLvl w:val="0"/>
       </w:pPr>
-      <w:r>
-        <w:t>4</w:t>
-      </w:r>
-      <w:r>
-        <w:tab/>
-      </w:r>
       <w:bookmarkStart w:id="14" w:name="_Toc210896271"/>
       <w:r>
         <w:t>PROJECT INFORMATION</w:t>
@@ -3469,12 +3354,6 @@
         <w:keepNext w:val="0"/>
         <w:outlineLvl w:val="0"/>
       </w:pPr>
-      <w:r>
-        <w:t>5</w:t>
-      </w:r>
-      <w:r>
-        <w:tab/>
-      </w:r>
       <w:bookmarkStart w:id="15" w:name="_Toc210896272"/>
       <w:r>
         <w:lastRenderedPageBreak/>
@@ -3531,12 +3410,6 @@
         <w:keepNext w:val="0"/>
         <w:outlineLvl w:val="0"/>
       </w:pPr>
-      <w:r>
-        <w:t>6</w:t>
-      </w:r>
-      <w:r>
-        <w:tab/>
-      </w:r>
       <w:bookmarkStart w:id="16" w:name="_Toc210896273"/>
       <w:r>
         <w:lastRenderedPageBreak/>
@@ -3568,12 +3441,6 @@
         <w:keepNext w:val="0"/>
         <w:outlineLvl w:val="0"/>
       </w:pPr>
-      <w:r>
-        <w:t>7</w:t>
-      </w:r>
-      <w:r>
-        <w:tab/>
-      </w:r>
       <w:bookmarkStart w:id="17" w:name="_Toc210896274"/>
       <w:r>
         <w:lastRenderedPageBreak/>
@@ -5479,7 +5346,7 @@
     <w:rPr>
       <w:rFonts w:ascii="Jost SemiBold" w:eastAsiaTheme="majorEastAsia" w:hAnsi="Jost SemiBold" w:cstheme="majorBidi"/>
       <w:b/>
-      <w:color w:val="000000" w:themeColor="text1"/>
+      <w:color w:val="FFFFFF" w:themeColor="background1"/>
       <w:spacing w:val="20"/>
       <w:kern w:val="28"/>
       <w:sz w:val="48"/>
@@ -5885,11 +5752,17 @@
     <w:autoRedefine/>
     <w:qFormat/>
     <w:rsid w:val="006C49F6"/>
+    <w:pPr>
+      <w:keepNext/>
+      <w:spacing w:before="360" w:after="80"/>
+    </w:pPr>
     <w:rPr>
       <w:rFonts w:ascii="Jost" w:eastAsia="Arial" w:hAnsi="Jost"/>
       <w:caps/>
       <w:noProof/>
-      <w:u w:val="single"/>
+      <w:color w:val="0F4761" w:themeColor="accent1"/>
+      <w:sz w:val="32"/>
+      <w:szCs w:val="32"/>
     </w:rPr>
   </w:style>
   <w:style w:type="character" w:customStyle="1" w:styleId="HeaderValueChar">
@@ -5913,10 +5786,13 @@
     <w:qFormat/>
     <w:rsid w:val="006C49F6"/>
     <w:pPr>
-      <w:ind w:left="720"/>
+      <w:spacing w:before="120" w:after="120"/>
+      <w:jc w:val="both"/>
     </w:pPr>
     <w:rPr>
       <w:rFonts w:ascii="Jost" w:hAnsi="Jost"/>
+      <w:sz w:val="22"/>
+      <w:szCs w:val="22"/>
     </w:rPr>
   </w:style>
   <w:style w:type="character" w:customStyle="1" w:styleId="BodyHeadingSectionTitleChar">

</xml_diff>

<commit_message>
Report: keep the letterhead header on the TOC page (match TwoBlues)
The Table-of-Contents page previously had its header blanked (a dedicated
cover+TOC section pointed at an empty header part), which left the maroon
address band floating alone with whitespace above it — looked unfinished.

The engineer's reference (TwoBlues.docx) keeps the full letterhead grid on the
TOC page. Match it: the cover+TOC section now copies the main section verbatim,
so page 2 (TOC) shows the same letterhead grid as the body while page 1 (cover)
stays header-free via titlePg. Removed the now-dead headerEmpty part, its
relationship, and content-type override.

Co-Authored-By: Claude Opus 4.8 <noreply@anthropic.com>
</commit_message>
<xml_diff>
--- a/app/modules/sam_report/assets/report_template_modern.docx
+++ b/app/modules/sam_report/assets/report_template_modern.docx
@@ -2209,7 +2209,7 @@
     <w:p>
       <w:pPr>
         <w:sectPr>
-          <w:headerReference w:type="default" r:id="rId950"/>
+          <w:headerReference w:type="default" r:id="rId15"/>
           <w:footerReference w:type="default" r:id="rId16"/>
           <w:pgSz w:w="12240" w:h="15840"/>
           <w:pgMar w:top="1267" w:right="547" w:bottom="446" w:left="446" w:header="187" w:footer="720" w:gutter="0"/>
@@ -4357,12 +4357,6 @@
       <w:pStyle w:val="Header"/>
     </w:pPr>
   </w:p>
-</w:hdr>
-</file>
-
-<file path=word/headerEmpty.xml><?xml version="1.0" encoding="utf-8"?>
-<w:hdr xmlns:w="http://schemas.openxmlformats.org/wordprocessingml/2006/main">
-  <w:p/>
 </w:hdr>
 </file>
 

</xml_diff>

<commit_message>
Report TOC: maroon title + drop the stray red address band (match TwoBlues)
Two TOC-page fixes to match the engineer's reference (TwoBlues.docx):

- Recolor the "Table of Contents" title from the .docm's gold (A29926) to the
  maroon (991F2B) TwoBlues uses for the same heading. It's the TOCHeading
  paragraph style (+ its linked Char style).

- Remove the cover's floating red address/email band shapes (docPr "Cover.Address"
  / "Cover.Email"). They're cover-design elements that LibreOffice lays out on the
  TOC page as a stray red band; the cover already carries this info in its Owner /
  EPC / Engineering-Company blocks, and TwoBlues shows no such band on the TOC.

Cover page is unaffected (the bands only ever rendered as TOC-page overflow).

Co-Authored-By: Claude Opus 4.8 <noreply@anthropic.com>
</commit_message>
<xml_diff>
--- a/app/modules/sam_report/assets/report_template_modern.docx
+++ b/app/modules/sam_report/assets/report_template_modern.docx
@@ -1331,407 +1331,11 @@
           <w:color w:val="FFFFFF" w:themeColor="background1"/>
           <w:szCs w:val="28"/>
         </w:rPr>
-        <mc:AlternateContent>
-          <mc:Choice Requires="wps">
-            <w:drawing>
-              <wp:anchor distT="45720" distB="45720" distL="114300" distR="114300" simplePos="0" relativeHeight="251688960" behindDoc="1" locked="0" layoutInCell="1" allowOverlap="1" wp14:anchorId="4D053E25" wp14:editId="7B9DA833">
-                <wp:simplePos x="0" y="0"/>
-                <wp:positionH relativeFrom="column">
-                  <wp:posOffset>5990095</wp:posOffset>
-                </wp:positionH>
-                <wp:positionV relativeFrom="paragraph">
-                  <wp:posOffset>445580</wp:posOffset>
-                </wp:positionV>
-                <wp:extent cx="2360930" cy="1404620"/>
-                <wp:effectExtent l="0" t="0" r="635" b="1270"/>
-                <wp:wrapNone/>
-                <wp:docPr id="365078311" name="Cover.Email">
-                  <a:hlinkClick xmlns:a="http://schemas.openxmlformats.org/drawingml/2006/main" r:id="rId10"/>
-                </wp:docPr>
-                <wp:cNvGraphicFramePr>
-                  <a:graphicFrameLocks xmlns:a="http://schemas.openxmlformats.org/drawingml/2006/main"/>
-                </wp:cNvGraphicFramePr>
-                <a:graphic xmlns:a="http://schemas.openxmlformats.org/drawingml/2006/main">
-                  <a:graphicData uri="http://schemas.microsoft.com/office/word/2010/wordprocessingShape">
-                    <wps:wsp>
-                      <wps:cNvSpPr txBox="1">
-                        <a:spLocks noChangeArrowheads="1"/>
-                      </wps:cNvSpPr>
-                      <wps:spPr bwMode="auto">
-                        <a:xfrm>
-                          <a:off x="0" y="0"/>
-                          <a:ext cx="2360930" cy="1404620"/>
-                        </a:xfrm>
-                        <a:prstGeom prst="rect">
-                          <a:avLst/>
-                        </a:prstGeom>
-                        <a:solidFill>
-                          <a:srgbClr val="991F2B"/>
-                        </a:solidFill>
-                        <a:ln w="9525">
-                          <a:noFill/>
-                          <a:miter lim="800000"/>
-                          <a:headEnd/>
-                          <a:tailEnd/>
-                        </a:ln>
-                      </wps:spPr>
-                      <wps:txbx>
-                        <w:txbxContent>
-                          <w:p>
-                            <w:pPr>
-                              <w:rPr>
-                                <w:rFonts w:ascii="Jost" w:hAnsi="Jost"/>
-                                <w:b/>
-                                <w:bCs/>
-                                <w:color w:val="FFFFFF" w:themeColor="background1"/>
-                                <w:sz w:val="18"/>
-                                <w:szCs w:val="14"/>
-                              </w:rPr>
-                            </w:pPr>
-                            <w:r>
-                              <w:rPr>
-                                <w:rFonts w:ascii="Jost" w:hAnsi="Jost"/>
-                                <w:b/>
-                                <w:bCs/>
-                                <w:color w:val="FFFFFF" w:themeColor="background1"/>
-                                <w:sz w:val="18"/>
-                                <w:szCs w:val="14"/>
-                              </w:rPr>
-                              <w:t>support@castillope.com</w:t>
-                            </w:r>
-                          </w:p>
-                        </w:txbxContent>
-                      </wps:txbx>
-                      <wps:bodyPr rot="0" vert="horz" wrap="square" lIns="91440" tIns="45720" rIns="91440" bIns="45720" anchor="t" anchorCtr="0">
-                        <a:spAutoFit/>
-                      </wps:bodyPr>
-                    </wps:wsp>
-                  </a:graphicData>
-                </a:graphic>
-                <wp14:sizeRelH relativeFrom="margin">
-                  <wp14:pctWidth>40000</wp14:pctWidth>
-                </wp14:sizeRelH>
-                <wp14:sizeRelV relativeFrom="margin">
-                  <wp14:pctHeight>20000</wp14:pctHeight>
-                </wp14:sizeRelV>
-              </wp:anchor>
-            </w:drawing>
-          </mc:Choice>
-          <mc:Fallback>
-            <w:pict>
-              <v:shape w14:anchorId="4D053E25" id="Cover.Email" o:spid="_x0000_s1033" type="#_x0000_t202" href="mailto:support@castillope.com" style="position:absolute;margin-left:471.65pt;margin-top:35.1pt;width:185.9pt;height:110.6pt;z-index:-251627520;visibility:visible;mso-wrap-style:square;mso-width-percent:400;mso-height-percent:200;mso-wrap-distance-left:9pt;mso-wrap-distance-top:3.6pt;mso-wrap-distance-right:9pt;mso-wrap-distance-bottom:3.6pt;mso-position-horizontal:absolute;mso-position-horizontal-relative:text;mso-position-vertical:absolute;mso-position-vertical-relative:text;mso-width-percent:400;mso-height-percent:200;mso-width-relative:margin;mso-height-relative:margin;v-text-anchor:top" o:gfxdata="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" o:button="t" fillcolor="#991f2b" stroked="f">
-                <v:fill o:detectmouseclick="t"/>
-                <v:textbox style="mso-fit-shape-to-text:t">
-                  <w:txbxContent>
-                    <w:p>
-                      <w:pPr>
-                        <w:rPr>
-                          <w:rFonts w:ascii="Jost" w:hAnsi="Jost"/>
-                          <w:b/>
-                          <w:bCs/>
-                          <w:color w:val="FFFFFF" w:themeColor="background1"/>
-                          <w:sz w:val="18"/>
-                          <w:szCs w:val="14"/>
-                        </w:rPr>
-                      </w:pPr>
-                      <w:r>
-                        <w:rPr>
-                          <w:rFonts w:ascii="Jost" w:hAnsi="Jost"/>
-                          <w:b/>
-                          <w:bCs/>
-                          <w:color w:val="FFFFFF" w:themeColor="background1"/>
-                          <w:sz w:val="18"/>
-                          <w:szCs w:val="14"/>
-                        </w:rPr>
-                        <w:t>support@castillope.com</w:t>
-                      </w:r>
-                    </w:p>
-                  </w:txbxContent>
-                </v:textbox>
-              </v:shape>
-            </w:pict>
-          </mc:Fallback>
-        </mc:AlternateContent>
       </w:r>
       <w:r>
         <w:rPr>
           <w:noProof/>
         </w:rPr>
-        <mc:AlternateContent>
-          <mc:Choice Requires="wps">
-            <w:drawing>
-              <wp:anchor distT="45720" distB="45720" distL="114300" distR="114300" simplePos="0" relativeHeight="251685888" behindDoc="1" locked="0" layoutInCell="1" allowOverlap="1" wp14:anchorId="3F0F7FA4" wp14:editId="6127DBC7">
-                <wp:simplePos x="0" y="0"/>
-                <wp:positionH relativeFrom="column">
-                  <wp:posOffset>-298928</wp:posOffset>
-                </wp:positionH>
-                <wp:positionV relativeFrom="paragraph">
-                  <wp:posOffset>447362</wp:posOffset>
-                </wp:positionV>
-                <wp:extent cx="7773035" cy="307075"/>
-                <wp:effectExtent l="0" t="0" r="0" b="0"/>
-                <wp:wrapNone/>
-                <wp:docPr id="217" name="Cover.Address">
-                  <a:hlinkClick xmlns:a="http://schemas.openxmlformats.org/drawingml/2006/main" r:id="rId11"/>
-                </wp:docPr>
-                <wp:cNvGraphicFramePr>
-                  <a:graphicFrameLocks xmlns:a="http://schemas.openxmlformats.org/drawingml/2006/main"/>
-                </wp:cNvGraphicFramePr>
-                <a:graphic xmlns:a="http://schemas.openxmlformats.org/drawingml/2006/main">
-                  <a:graphicData uri="http://schemas.microsoft.com/office/word/2010/wordprocessingShape">
-                    <wps:wsp>
-                      <wps:cNvSpPr txBox="1">
-                        <a:spLocks noChangeArrowheads="1"/>
-                      </wps:cNvSpPr>
-                      <wps:spPr bwMode="auto">
-                        <a:xfrm>
-                          <a:off x="0" y="0"/>
-                          <a:ext cx="7773035" cy="307075"/>
-                        </a:xfrm>
-                        <a:prstGeom prst="rect">
-                          <a:avLst/>
-                        </a:prstGeom>
-                        <a:solidFill>
-                          <a:srgbClr val="991F2B"/>
-                        </a:solidFill>
-                        <a:ln w="9525">
-                          <a:noFill/>
-                          <a:miter lim="800000"/>
-                          <a:headEnd/>
-                          <a:tailEnd/>
-                        </a:ln>
-                      </wps:spPr>
-                      <wps:txbx>
-                        <w:txbxContent>
-                          <w:p>
-                            <w:pPr>
-                              <w:rPr>
-                                <w:b/>
-                                <w:bCs/>
-                                <w:color w:val="FFFFFF" w:themeColor="background1"/>
-                                <w:sz w:val="18"/>
-                                <w:szCs w:val="14"/>
-                              </w:rPr>
-                            </w:pPr>
-                            <w:r>
-                              <w:rPr>
-                                <w:rFonts w:ascii="Jost" w:hAnsi="Jost"/>
-                                <w:b/>
-                                <w:bCs/>
-                                <w:color w:val="FFFFFF" w:themeColor="background1"/>
-                                <w:sz w:val="18"/>
-                                <w:szCs w:val="14"/>
-                              </w:rPr>
-                              <w:t>1060 Maitland Center Commons Suite 270, Maitland, FL 32751</w:t>
-                            </w:r>
-                            <w:r>
-                              <w:rPr>
-                                <w:rFonts w:ascii="Jost" w:hAnsi="Jost"/>
-                                <w:b/>
-                                <w:bCs/>
-                                <w:color w:val="FFFFFF" w:themeColor="background1"/>
-                                <w:sz w:val="18"/>
-                                <w:szCs w:val="14"/>
-                              </w:rPr>
-                              <w:tab/>
-                            </w:r>
-                            <w:r>
-                              <w:rPr>
-                                <w:rFonts w:ascii="Jost" w:hAnsi="Jost"/>
-                                <w:b/>
-                                <w:bCs/>
-                                <w:color w:val="FFFFFF" w:themeColor="background1"/>
-                                <w:sz w:val="18"/>
-                                <w:szCs w:val="14"/>
-                              </w:rPr>
-                              <w:tab/>
-                            </w:r>
-                            <w:r>
-                              <w:rPr>
-                                <w:rFonts w:ascii="Jost" w:hAnsi="Jost"/>
-                                <w:b/>
-                                <w:bCs/>
-                                <w:color w:val="FFFFFF" w:themeColor="background1"/>
-                                <w:sz w:val="18"/>
-                                <w:szCs w:val="14"/>
-                              </w:rPr>
-                              <w:tab/>
-                            </w:r>
-                            <w:r>
-                              <w:rPr>
-                                <w:rFonts w:ascii="Jost" w:hAnsi="Jost"/>
-                                <w:b/>
-                                <w:bCs/>
-                                <w:color w:val="FFFFFF" w:themeColor="background1"/>
-                                <w:sz w:val="18"/>
-                                <w:szCs w:val="14"/>
-                              </w:rPr>
-                              <w:tab/>
-                              <w:t xml:space="preserve">           </w:t>
-                            </w:r>
-                            <w:r>
-                              <w:rPr>
-                                <w:rFonts w:ascii="Jost" w:hAnsi="Jost"/>
-                                <w:b/>
-                                <w:bCs/>
-                                <w:color w:val="FFFFFF" w:themeColor="background1"/>
-                                <w:sz w:val="18"/>
-                                <w:szCs w:val="14"/>
-                              </w:rPr>
-                              <w:tab/>
-                            </w:r>
-                            <w:r>
-                              <w:rPr>
-                                <w:rFonts w:ascii="Jost" w:hAnsi="Jost"/>
-                                <w:b/>
-                                <w:bCs/>
-                                <w:color w:val="FFFFFF" w:themeColor="background1"/>
-                                <w:sz w:val="18"/>
-                                <w:szCs w:val="14"/>
-                              </w:rPr>
-                              <w:tab/>
-                            </w:r>
-                            <w:r>
-                              <w:rPr>
-                                <w:rFonts w:ascii="Jost" w:hAnsi="Jost"/>
-                                <w:b/>
-                                <w:bCs/>
-                                <w:color w:val="FFFFFF" w:themeColor="background1"/>
-                                <w:sz w:val="18"/>
-                                <w:szCs w:val="14"/>
-                              </w:rPr>
-                              <w:tab/>
-                            </w:r>
-                          </w:p>
-                        </w:txbxContent>
-                      </wps:txbx>
-                      <wps:bodyPr rot="0" vert="horz" wrap="square" lIns="91440" tIns="45720" rIns="91440" bIns="45720" anchor="t" anchorCtr="0">
-                        <a:noAutofit/>
-                      </wps:bodyPr>
-                    </wps:wsp>
-                  </a:graphicData>
-                </a:graphic>
-                <wp14:sizeRelH relativeFrom="margin">
-                  <wp14:pctWidth>0</wp14:pctWidth>
-                </wp14:sizeRelH>
-                <wp14:sizeRelV relativeFrom="margin">
-                  <wp14:pctHeight>0</wp14:pctHeight>
-                </wp14:sizeRelV>
-              </wp:anchor>
-            </w:drawing>
-          </mc:Choice>
-          <mc:Fallback>
-            <w:pict>
-              <v:shape w14:anchorId="3F0F7FA4" id="Cover.Address" o:spid="_x0000_s1034" type="#_x0000_t202" href="https://www.google.com/maps/place/1060+Maitland+Center+Commons+Blvd,+Maitland,+FL+32751/@28.6393906,-81.3961306,16z/data=!3m1!4b1!4m6!3m5!1s0x88e7711b42fcc27d:0x1820b5db80392a6!8m2!3d28.6393906!4d-81.3961306!16s%2Fg%2F11bw3xpv39?entry=ttu&amp;g_ep=EgoyMDI1MTExMC4wIKXMDSoASAFQAw%3D%3D" style="position:absolute;margin-left:-23.55pt;margin-top:35.25pt;width:612.05pt;height:24.2pt;z-index:-251630592;visibility:visible;mso-wrap-style:square;mso-width-percent:0;mso-height-percent:0;mso-wrap-distance-left:9pt;mso-wrap-distance-top:3.6pt;mso-wrap-distance-right:9pt;mso-wrap-distance-bottom:3.6pt;mso-position-horizontal:absolute;mso-position-horizontal-relative:text;mso-position-vertical:absolute;mso-position-vertical-relative:text;mso-width-percent:0;mso-height-percent:0;mso-width-relative:margin;mso-height-relative:margin;v-text-anchor:top" o:gfxdata="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" o:button="t" fillcolor="#991f2b" stroked="f">
-                <v:fill o:detectmouseclick="t"/>
-                <v:textbox>
-                  <w:txbxContent>
-                    <w:p>
-                      <w:pPr>
-                        <w:rPr>
-                          <w:b/>
-                          <w:bCs/>
-                          <w:color w:val="FFFFFF" w:themeColor="background1"/>
-                          <w:sz w:val="18"/>
-                          <w:szCs w:val="14"/>
-                        </w:rPr>
-                      </w:pPr>
-                      <w:r>
-                        <w:rPr>
-                          <w:rFonts w:ascii="Jost" w:hAnsi="Jost"/>
-                          <w:b/>
-                          <w:bCs/>
-                          <w:color w:val="FFFFFF" w:themeColor="background1"/>
-                          <w:sz w:val="18"/>
-                          <w:szCs w:val="14"/>
-                        </w:rPr>
-                        <w:t>1060 Maitland Center Commons Suite 270, Maitland, FL 32751</w:t>
-                      </w:r>
-                      <w:r>
-                        <w:rPr>
-                          <w:rFonts w:ascii="Jost" w:hAnsi="Jost"/>
-                          <w:b/>
-                          <w:bCs/>
-                          <w:color w:val="FFFFFF" w:themeColor="background1"/>
-                          <w:sz w:val="18"/>
-                          <w:szCs w:val="14"/>
-                        </w:rPr>
-                        <w:tab/>
-                      </w:r>
-                      <w:r>
-                        <w:rPr>
-                          <w:rFonts w:ascii="Jost" w:hAnsi="Jost"/>
-                          <w:b/>
-                          <w:bCs/>
-                          <w:color w:val="FFFFFF" w:themeColor="background1"/>
-                          <w:sz w:val="18"/>
-                          <w:szCs w:val="14"/>
-                        </w:rPr>
-                        <w:tab/>
-                      </w:r>
-                      <w:r>
-                        <w:rPr>
-                          <w:rFonts w:ascii="Jost" w:hAnsi="Jost"/>
-                          <w:b/>
-                          <w:bCs/>
-                          <w:color w:val="FFFFFF" w:themeColor="background1"/>
-                          <w:sz w:val="18"/>
-                          <w:szCs w:val="14"/>
-                        </w:rPr>
-                        <w:tab/>
-                      </w:r>
-                      <w:r>
-                        <w:rPr>
-                          <w:rFonts w:ascii="Jost" w:hAnsi="Jost"/>
-                          <w:b/>
-                          <w:bCs/>
-                          <w:color w:val="FFFFFF" w:themeColor="background1"/>
-                          <w:sz w:val="18"/>
-                          <w:szCs w:val="14"/>
-                        </w:rPr>
-                        <w:tab/>
-                        <w:t xml:space="preserve">           </w:t>
-                      </w:r>
-                      <w:r>
-                        <w:rPr>
-                          <w:rFonts w:ascii="Jost" w:hAnsi="Jost"/>
-                          <w:b/>
-                          <w:bCs/>
-                          <w:color w:val="FFFFFF" w:themeColor="background1"/>
-                          <w:sz w:val="18"/>
-                          <w:szCs w:val="14"/>
-                        </w:rPr>
-                        <w:tab/>
-                      </w:r>
-                      <w:r>
-                        <w:rPr>
-                          <w:rFonts w:ascii="Jost" w:hAnsi="Jost"/>
-                          <w:b/>
-                          <w:bCs/>
-                          <w:color w:val="FFFFFF" w:themeColor="background1"/>
-                          <w:sz w:val="18"/>
-                          <w:szCs w:val="14"/>
-                        </w:rPr>
-                        <w:tab/>
-                      </w:r>
-                      <w:r>
-                        <w:rPr>
-                          <w:rFonts w:ascii="Jost" w:hAnsi="Jost"/>
-                          <w:b/>
-                          <w:bCs/>
-                          <w:color w:val="FFFFFF" w:themeColor="background1"/>
-                          <w:sz w:val="18"/>
-                          <w:szCs w:val="14"/>
-                        </w:rPr>
-                        <w:tab/>
-                      </w:r>
-                    </w:p>
-                  </w:txbxContent>
-                </v:textbox>
-              </v:shape>
-            </w:pict>
-          </mc:Fallback>
-        </mc:AlternateContent>
       </w:r>
     </w:p>
     <w:p/>
@@ -5757,7 +5361,7 @@
       <w:rFonts w:ascii="Jost" w:hAnsi="Jost"/>
       <w:b/>
       <w:bCs/>
-      <w:color w:val="A29926"/>
+      <w:color w:val="991F2B"/>
       <w:sz w:val="48"/>
       <w:szCs w:val="40"/>
     </w:rPr>
@@ -5783,7 +5387,7 @@
       <w:rFonts w:ascii="Jost" w:eastAsia="Times New Roman" w:hAnsi="Jost" w:cs="Times New Roman"/>
       <w:b/>
       <w:bCs/>
-      <w:color w:val="A29926"/>
+      <w:color w:val="991F2B"/>
       <w:kern w:val="0"/>
       <w:sz w:val="48"/>
       <w:szCs w:val="40"/>

</xml_diff>

<commit_message>
Report TOC: move the heading under the red rule, above the entries
The "Table of Contents" heading was a floating textbox pinned to the top of the
page, overlapping the letterhead grid. Blank that floating copy (its sibling red
rule "TOC.Rule" stays put) and re-add the heading inline immediately above the
entries, so it reads under the rule and right on top of the list.

Co-Authored-By: Claude Opus 4.8 <noreply@anthropic.com>
</commit_message>
<xml_diff>
--- a/app/modules/sam_report/assets/report_template_modern.docx
+++ b/app/modules/sam_report/assets/report_template_modern.docx
@@ -1478,15 +1478,6 @@
                               <w:pPr>
                                 <w:pStyle w:val="TOCHeading"/>
                               </w:pPr>
-                              <w:r>
-                                <w:t xml:space="preserve">Table of </w:t>
-                              </w:r>
-                              <w:r>
-                                <w:t>Content</w:t>
-                              </w:r>
-                              <w:r>
-                                <w:t>s</w:t>
-                              </w:r>
                             </w:p>
                           </w:txbxContent>
                         </wps:txbx>
@@ -1535,15 +1526,6 @@
                         <w:pPr>
                           <w:pStyle w:val="TOCHeading"/>
                         </w:pPr>
-                        <w:r>
-                          <w:t xml:space="preserve">Table of </w:t>
-                        </w:r>
-                        <w:r>
-                          <w:t>Content</w:t>
-                        </w:r>
-                        <w:r>
-                          <w:t>s</w:t>
-                        </w:r>
                       </w:p>
                     </w:txbxContent>
                   </v:textbox>
@@ -1593,6 +1575,18 @@
           <w:szCs w:val="28"/>
         </w:rPr>
         <w:tab/>
+      </w:r>
+    </w:p>
+    <w:p>
+      <w:pPr>
+        <w:pStyle w:val="TOCHeading"/>
+        <w:spacing w:before="240" w:after="120"/>
+      </w:pPr>
+      <w:r>
+        <w:rPr>
+          <w:rFonts w:ascii="Jost" w:hAnsi="Jost"/>
+        </w:rPr>
+        <w:t>Table of Contents</w:t>
       </w:r>
     </w:p>
     <w:p>

</xml_diff>

<commit_message>
Report TOC: tighten the heading/entries up under the red rule
The rule + heading were a floating group pinned to the top of the page, which
left a big gap between the red rule and the entries. Remove that whole group and
rebuild the maroon rule and "Table of Contents" heading inline, immediately above
the entries, so the block reads together: rule -> heading -> list. Cover sheet is
unchanged (the group only ever rendered on the TOC page).

Co-Authored-By: Claude Opus 4.8 <noreply@anthropic.com>
</commit_message>
<xml_diff>
--- a/app/modules/sam_report/assets/report_template_modern.docx
+++ b/app/modules/sam_report/assets/report_template_modern.docx
@@ -1358,183 +1358,6 @@
         <w:rPr>
           <w:noProof/>
         </w:rPr>
-        <mc:AlternateContent>
-          <mc:Choice Requires="wpg">
-            <w:drawing>
-              <wp:anchor distT="45720" distB="45720" distL="182880" distR="182880" simplePos="0" relativeHeight="251677696" behindDoc="0" locked="0" layoutInCell="1" allowOverlap="1" wp14:anchorId="61858A2F" wp14:editId="5B36A400">
-                <wp:simplePos x="0" y="0"/>
-                <wp:positionH relativeFrom="margin">
-                  <wp:posOffset>0</wp:posOffset>
-                </wp:positionH>
-                <wp:positionV relativeFrom="margin">
-                  <wp:posOffset>-94483</wp:posOffset>
-                </wp:positionV>
-                <wp:extent cx="7251700" cy="551180"/>
-                <wp:effectExtent l="0" t="0" r="6350" b="1270"/>
-                <wp:wrapSquare wrapText="bothSides"/>
-                <wp:docPr id="198" name="Group 203"/>
-                <wp:cNvGraphicFramePr/>
-                <a:graphic xmlns:a="http://schemas.openxmlformats.org/drawingml/2006/main">
-                  <a:graphicData uri="http://schemas.microsoft.com/office/word/2010/wordprocessingGroup">
-                    <wpg:wgp>
-                      <wpg:cNvGrpSpPr/>
-                      <wpg:grpSpPr>
-                        <a:xfrm>
-                          <a:off x="0" y="0"/>
-                          <a:ext cx="7251700" cy="551180"/>
-                          <a:chOff x="0" y="252677"/>
-                          <a:chExt cx="3567448" cy="632166"/>
-                        </a:xfrm>
-                      </wpg:grpSpPr>
-                      <wps:wsp>
-                        <wps:cNvPr id="199" name="TOC.Rule"/>
-                        <wps:cNvSpPr/>
-                        <wps:spPr>
-                          <a:xfrm>
-                            <a:off x="0" y="791044"/>
-                            <a:ext cx="3567448" cy="93799"/>
-                          </a:xfrm>
-                          <a:prstGeom prst="rect">
-                            <a:avLst/>
-                          </a:prstGeom>
-                          <a:solidFill>
-                            <a:srgbClr val="991F2B"/>
-                          </a:solidFill>
-                          <a:ln>
-                            <a:noFill/>
-                          </a:ln>
-                        </wps:spPr>
-                        <wps:style>
-                          <a:lnRef idx="2">
-                            <a:schemeClr val="accent1">
-                              <a:shade val="50000"/>
-                            </a:schemeClr>
-                          </a:lnRef>
-                          <a:fillRef idx="1">
-                            <a:schemeClr val="accent1"/>
-                          </a:fillRef>
-                          <a:effectRef idx="0">
-                            <a:schemeClr val="accent1"/>
-                          </a:effectRef>
-                          <a:fontRef idx="minor">
-                            <a:schemeClr val="lt1"/>
-                          </a:fontRef>
-                        </wps:style>
-                        <wps:txbx>
-                          <w:txbxContent>
-                            <w:p>
-                              <w:pPr>
-                                <w:jc w:val="center"/>
-                                <w:rPr>
-                                  <w:rFonts w:asciiTheme="majorHAnsi" w:eastAsiaTheme="majorEastAsia" w:hAnsiTheme="majorHAnsi" w:cstheme="majorBidi"/>
-                                  <w:color w:val="FFFFFF" w:themeColor="background1"/>
-                                  <w:szCs w:val="28"/>
-                                </w:rPr>
-                              </w:pPr>
-                            </w:p>
-                          </w:txbxContent>
-                        </wps:txbx>
-                        <wps:bodyPr rot="0" spcFirstLastPara="0" vertOverflow="overflow" horzOverflow="overflow" vert="horz" wrap="square" lIns="91440" tIns="45720" rIns="91440" bIns="45720" numCol="1" spcCol="0" rtlCol="0" fromWordArt="0" anchor="ctr" anchorCtr="0" forceAA="0" compatLnSpc="1">
-                          <a:prstTxWarp prst="textNoShape">
-                            <a:avLst/>
-                          </a:prstTxWarp>
-                          <a:noAutofit/>
-                        </wps:bodyPr>
-                      </wps:wsp>
-                      <wps:wsp>
-                        <wps:cNvPr id="200" name="TOC.Header"/>
-                        <wps:cNvSpPr txBox="1"/>
-                        <wps:spPr>
-                          <a:xfrm>
-                            <a:off x="0" y="252677"/>
-                            <a:ext cx="3567448" cy="538366"/>
-                          </a:xfrm>
-                          <a:prstGeom prst="rect">
-                            <a:avLst/>
-                          </a:prstGeom>
-                          <a:noFill/>
-                          <a:ln w="6350">
-                            <a:noFill/>
-                          </a:ln>
-                          <a:effectLst/>
-                        </wps:spPr>
-                        <wps:style>
-                          <a:lnRef idx="0">
-                            <a:schemeClr val="accent1"/>
-                          </a:lnRef>
-                          <a:fillRef idx="0">
-                            <a:schemeClr val="accent1"/>
-                          </a:fillRef>
-                          <a:effectRef idx="0">
-                            <a:schemeClr val="accent1"/>
-                          </a:effectRef>
-                          <a:fontRef idx="minor">
-                            <a:schemeClr val="dk1"/>
-                          </a:fontRef>
-                        </wps:style>
-                        <wps:txbx>
-                          <w:txbxContent>
-                            <w:p>
-                              <w:pPr>
-                                <w:pStyle w:val="TOCHeading"/>
-                              </w:pPr>
-                            </w:p>
-                          </w:txbxContent>
-                        </wps:txbx>
-                        <wps:bodyPr rot="0" spcFirstLastPara="0" vertOverflow="overflow" horzOverflow="overflow" vert="horz" wrap="square" lIns="91440" tIns="91440" rIns="91440" bIns="0" numCol="1" spcCol="0" rtlCol="0" fromWordArt="0" anchor="t" anchorCtr="0" forceAA="0" compatLnSpc="1">
-                          <a:prstTxWarp prst="textNoShape">
-                            <a:avLst/>
-                          </a:prstTxWarp>
-                          <a:noAutofit/>
-                        </wps:bodyPr>
-                      </wps:wsp>
-                    </wpg:wgp>
-                  </a:graphicData>
-                </a:graphic>
-                <wp14:sizeRelH relativeFrom="margin">
-                  <wp14:pctWidth>0</wp14:pctWidth>
-                </wp14:sizeRelH>
-                <wp14:sizeRelV relativeFrom="margin">
-                  <wp14:pctHeight>0</wp14:pctHeight>
-                </wp14:sizeRelV>
-              </wp:anchor>
-            </w:drawing>
-          </mc:Choice>
-          <mc:Fallback>
-            <w:pict>
-              <v:group w14:anchorId="61858A2F" id="Group 203" o:spid="_x0000_s1035" style="position:absolute;margin-left:0;margin-top:-7.45pt;width:571pt;height:43.4pt;z-index:251677696;mso-wrap-distance-left:14.4pt;mso-wrap-distance-top:3.6pt;mso-wrap-distance-right:14.4pt;mso-wrap-distance-bottom:3.6pt;mso-position-horizontal-relative:margin;mso-position-vertical-relative:margin;mso-width-relative:margin;mso-height-relative:margin" coordorigin=",2526" coordsize="35674,6321" o:gfxdata="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">
-                <v:rect id="TOC.Rule" o:spid="_x0000_s1036" style="position:absolute;top:7910;width:35674;height:938;visibility:visible;mso-wrap-style:square;v-text-anchor:middle" o:gfxdata="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" fillcolor="#991f2b" stroked="f" strokeweight="1.5pt">
-                  <v:textbox>
-                    <w:txbxContent>
-                      <w:p>
-                        <w:pPr>
-                          <w:jc w:val="center"/>
-                          <w:rPr>
-                            <w:rFonts w:asciiTheme="majorHAnsi" w:eastAsiaTheme="majorEastAsia" w:hAnsiTheme="majorHAnsi" w:cstheme="majorBidi"/>
-                            <w:color w:val="FFFFFF" w:themeColor="background1"/>
-                            <w:szCs w:val="28"/>
-                          </w:rPr>
-                        </w:pPr>
-                      </w:p>
-                    </w:txbxContent>
-                  </v:textbox>
-                </v:rect>
-                <v:shape id="TOC.Header" o:spid="_x0000_s1037" type="#_x0000_t202" style="position:absolute;top:2526;width:35674;height:5384;visibility:visible;mso-wrap-style:square;v-text-anchor:top" o:gfxdata="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" filled="f" stroked="f" strokeweight=".5pt">
-                  <v:textbox inset=",7.2pt,,0">
-                    <w:txbxContent>
-                      <w:p>
-                        <w:pPr>
-                          <w:pStyle w:val="TOCHeading"/>
-                        </w:pPr>
-                      </w:p>
-                    </w:txbxContent>
-                  </v:textbox>
-                </v:shape>
-                <w10:wrap type="square" anchorx="margin" anchory="margin"/>
-              </v:group>
-            </w:pict>
-          </mc:Fallback>
-        </mc:AlternateContent>
       </w:r>
       <w:r>
         <w:rPr>
@@ -1579,8 +1402,14 @@
     </w:p>
     <w:p>
       <w:pPr>
+        <w:spacing w:before="0" w:after="160" w:line="130" w:lineRule="exact"/>
+        <w:shd w:val="clear" w:color="auto" w:fill="991F2B"/>
+      </w:pPr>
+    </w:p>
+    <w:p>
+      <w:pPr>
         <w:pStyle w:val="TOCHeading"/>
-        <w:spacing w:before="240" w:after="120"/>
+        <w:spacing w:before="40" w:after="80"/>
       </w:pPr>
       <w:r>
         <w:rPr>

</xml_diff>